<commit_message>
add demo to flow
</commit_message>
<xml_diff>
--- a/public/resume.docx
+++ b/public/resume.docx
@@ -1061,16 +1061,7 @@
                 <w:sz w:val="19"/>
                 <w:szCs w:val="19"/>
               </w:rPr>
-              <w:t xml:space="preserve">Git  ·  GitHub  ·  Docker (basic)  ·  Linux (basic)  ·  </w:t>
-            </w:r>
-            <w:r>
-              <w:rPr>
-                <w:rFonts w:eastAsia="Calibri" w:cs="Calibri" w:ascii="Calibri" w:hAnsi="Calibri"/>
-                <w:color w:val="444444"/>
-                <w:sz w:val="19"/>
-                <w:szCs w:val="19"/>
-              </w:rPr>
-              <w:t>AI-assisted Developments  ·  Prompt Engineering</w:t>
+              <w:t>Git  ·  GitHub  ·  Docker (basic)  ·  Linux (basic)  ·  AI-assisted Developments  ·  Prompt Engineering</w:t>
             </w:r>
           </w:p>
         </w:tc>
@@ -1744,7 +1735,7 @@
     <w:pPr>
       <w:widowControl w:val="false"/>
       <w:suppressAutoHyphens w:val="true"/>
-      <w:overflowPunct w:val="true"/>
+      <w:overflowPunct w:val="false"/>
       <w:bidi w:val="0"/>
       <w:spacing w:before="0" w:after="0"/>
       <w:jc w:val="start"/>
@@ -1827,15 +1818,15 @@
       <w:u w:val="single"/>
     </w:rPr>
   </w:style>
+  <w:style w:type="character" w:styleId="FootnoteCharactersuser">
+    <w:name w:val="Footnote Characters (user)"/>
+    <w:qFormat/>
+    <w:rPr>
+      <w:vertAlign w:val="superscript"/>
+    </w:rPr>
+  </w:style>
   <w:style w:type="character" w:styleId="FootnoteCharacters">
     <w:name w:val="Footnote Characters"/>
-    <w:qFormat/>
-    <w:rPr>
-      <w:vertAlign w:val="superscript"/>
-    </w:rPr>
-  </w:style>
-  <w:style w:type="character" w:styleId="FootnoteCharactersuser">
-    <w:name w:val="Footnote Characters (user)"/>
     <w:qFormat/>
     <w:rPr>
       <w:vertAlign w:val="superscript"/>
@@ -1856,15 +1847,15 @@
       <w:szCs w:val="20"/>
     </w:rPr>
   </w:style>
+  <w:style w:type="character" w:styleId="EndnoteCharactersuser">
+    <w:name w:val="Endnote Characters (user)"/>
+    <w:qFormat/>
+    <w:rPr>
+      <w:vertAlign w:val="superscript"/>
+    </w:rPr>
+  </w:style>
   <w:style w:type="character" w:styleId="EndnoteCharacters">
     <w:name w:val="Endnote Characters"/>
-    <w:qFormat/>
-    <w:rPr>
-      <w:vertAlign w:val="superscript"/>
-    </w:rPr>
-  </w:style>
-  <w:style w:type="character" w:styleId="EndnoteCharactersuser">
-    <w:name w:val="Endnote Characters (user)"/>
     <w:qFormat/>
     <w:rPr>
       <w:vertAlign w:val="superscript"/>
@@ -1959,7 +1950,7 @@
     <w:pPr>
       <w:widowControl w:val="false"/>
       <w:suppressAutoHyphens w:val="true"/>
-      <w:overflowPunct w:val="true"/>
+      <w:overflowPunct w:val="false"/>
       <w:bidi w:val="0"/>
       <w:spacing w:before="0" w:after="0"/>
       <w:jc w:val="start"/>
@@ -1981,7 +1972,7 @@
     <w:pPr>
       <w:widowControl w:val="false"/>
       <w:suppressAutoHyphens w:val="true"/>
-      <w:overflowPunct w:val="true"/>
+      <w:overflowPunct w:val="false"/>
       <w:bidi w:val="0"/>
       <w:spacing w:before="0" w:after="0"/>
       <w:jc w:val="start"/>
@@ -2034,6 +2025,7 @@
     <w:qFormat/>
     <w:pPr>
       <w:widowControl/>
+      <w:suppressAutoHyphens w:val="true"/>
       <w:bidi w:val="0"/>
       <w:spacing w:before="0" w:after="0"/>
       <w:jc w:val="start"/>

</xml_diff>